<commit_message>
feat(db): 13 表口径落地并 psql 实跑通过（4 态房态 / room_block / reservation_price）
- sql/01_schema.sql：13 张表，新增 room_block（维修/停用区间）、reservation_price（逐日成交价格），
  房态改为 4 态（available/cleaning/maintenance/disabled），已预订/入住中由订单推导
- sql/02_constraints.sql：3 条 EXCLUDE（订单重叠、价格方案重叠、封禁区间重叠）、12 触发器、
  2 视图、8 函数；新增跨表校验 fn_check_reservation_block / fn_check_room_block_order（23514）
- sql/03_seed.sql：生成器扩量重生成 —— 30 客户 / 96 预订 / 48 入住 / 96 支付 / 57 服务明细 /
  reservation_price 239 行 / room_block 4 段封禁；room_status_log 降为 11
- sql/04_queries.sql：Q1-Q8 按新口径重写（Q1 排除封禁区间、Q3 扣维修停用房夜、
  Q4 按 actual_checkout_at 归月），实测 Q1 = 35 间
- docs/02 重写为 13 表 / 4 态房态（ER、约束、索引、触发器、B1-B12 边界用例）；
  docs/01、docs/03、docs/05、README、AGENTS.md 全部对齐；新建 docs/页面约定.md
- deliverables：提交件 v2（A4 三页 + xlsx 12x5 + 300dpi 截图，39 项断言 PASS）
- 实跑证据：table_count=13；reservation_price 239；金额不一致 0；overlap_pairs=0；
  DO 块 9 步自检全过（23P01 + 23514）；EXPLAIN 6.264 ms / shared hit=233
</commit_message>
<xml_diff>
--- a/deliverables/第14组_酒店客房预订与入住管理系统.docx
+++ b/deliverables/第14组_酒店客房预订与入住管理系统.docx
@@ -34,6 +34,7 @@
     </w:p>
     <w:p>
       <w:pPr>
+        <w:keepNext w:val="0"/>
         <w:spacing w:lineRule="exact" w:line="400" w:before="0" w:after="0"/>
         <w:ind w:firstLine="480"/>
         <w:jc w:val="both"/>
@@ -50,6 +51,7 @@
     </w:p>
     <w:p>
       <w:pPr>
+        <w:keepNext w:val="0"/>
         <w:spacing w:lineRule="exact" w:line="400" w:before="0" w:after="0"/>
         <w:ind w:firstLine="480"/>
         <w:jc w:val="both"/>
@@ -66,6 +68,7 @@
     </w:p>
     <w:p>
       <w:pPr>
+        <w:keepNext w:val="0"/>
         <w:spacing w:lineRule="exact" w:line="400" w:before="0" w:after="0"/>
         <w:ind w:firstLine="480"/>
         <w:jc w:val="both"/>
@@ -82,6 +85,7 @@
     </w:p>
     <w:p>
       <w:pPr>
+        <w:keepNext w:val="0"/>
         <w:spacing w:lineRule="exact" w:line="400" w:before="0" w:after="0"/>
         <w:ind w:firstLine="480"/>
         <w:jc w:val="both"/>
@@ -98,6 +102,7 @@
     </w:p>
     <w:p>
       <w:pPr>
+        <w:keepNext w:val="0"/>
         <w:spacing w:lineRule="exact" w:line="400" w:before="0" w:after="0"/>
         <w:ind w:firstLine="480"/>
         <w:jc w:val="both"/>
@@ -129,6 +134,7 @@
     </w:p>
     <w:p>
       <w:pPr>
+        <w:keepNext w:val="0"/>
         <w:spacing w:lineRule="exact" w:line="400" w:before="0" w:after="0"/>
         <w:ind w:firstLine="480"/>
         <w:jc w:val="both"/>
@@ -140,11 +146,12 @@
           <w:color w:val="000000"/>
           <w:sz w:val="24"/>
         </w:rPr>
-        <w:t>面向中小型酒店的客房管理系统：客户按日期区间查询可用房间并在线预订，前台办理入住、退房与费用结算并调度房态，管理员维护房型、房间与价格并查看入住率和营业收入统计；数据库层用日期区间排他约束保证同一房间在重叠日期内绝不会被重复预订。</w:t>
+        <w:t>本系统面向中小型酒店，支持客户按日期查询房间并预订，前台办理入住、续住、退房与费用结算，管理员维护基础信息并查看经营统计。系统聚焦预订—入住—退房—统计主流程，不包含会员营销、渠道直连与硬件对接。</w:t>
       </w:r>
     </w:p>
     <w:p>
       <w:pPr>
+        <w:keepNext w:val="0"/>
         <w:spacing w:lineRule="exact" w:line="400" w:before="0" w:after="0"/>
         <w:ind w:firstLine="480"/>
         <w:jc w:val="both"/>
@@ -156,11 +163,12 @@
           <w:color w:val="000000"/>
           <w:sz w:val="24"/>
         </w:rPr>
-        <w:t>酒店客房业务的核心矛盾是“房间在时间维度上的独占性”：同一间房在同一晚只能卖给一位客户，而一位客户可能连续住多晚、也可能续住或提前退房。本系统把预订、入住、结算、房态建成相互关联的数据对象，围绕预订—入住—退房—统计展开。</w:t>
+        <w:t>客户侧：按入住日期、离店日期、房型及人数查询可预订房间；提交、查看和取消自己的预订；查询本人历史入住及消费记录。</w:t>
       </w:r>
     </w:p>
     <w:p>
       <w:pPr>
+        <w:keepNext w:val="0"/>
         <w:spacing w:lineRule="exact" w:line="400" w:before="0" w:after="0"/>
         <w:ind w:firstLine="480"/>
         <w:jc w:val="both"/>
@@ -172,11 +180,12 @@
           <w:color w:val="000000"/>
           <w:sz w:val="24"/>
         </w:rPr>
-        <w:t>客户侧：按入住/离店日期、房型、人数查询可用房间；提交预订、查看与取消自己的预订；查看历史入住与消费记录。</w:t>
+        <w:t>前台侧：确认预订、处理取消和未到店，办理预订入住与散客入住、续住、提前退房及结算，维护清洁与维修状态。管理员侧：维护房型、房间、价格及员工账号，查看入住率、营业收入、热门房型和长期空闲房间等统计。</w:t>
       </w:r>
     </w:p>
     <w:p>
       <w:pPr>
+        <w:keepNext w:val="0"/>
         <w:spacing w:lineRule="exact" w:line="400" w:before="0" w:after="0"/>
         <w:ind w:firstLine="480"/>
         <w:jc w:val="both"/>
@@ -188,11 +197,12 @@
           <w:color w:val="000000"/>
           <w:sz w:val="24"/>
         </w:rPr>
-        <w:t>前台侧：核验预订办理入住、办理退房并结算房费与增值服务、处理未到店与取消、调度房态（清洁中/维修中）。</w:t>
+        <w:t>核心业务规则如下：</w:t>
       </w:r>
     </w:p>
     <w:p>
       <w:pPr>
+        <w:keepNext w:val="0"/>
         <w:spacing w:lineRule="exact" w:line="400" w:before="0" w:after="0"/>
         <w:ind w:firstLine="480"/>
         <w:jc w:val="both"/>
@@ -204,11 +214,12 @@
           <w:color w:val="000000"/>
           <w:sz w:val="24"/>
         </w:rPr>
-        <w:t>管理员侧：维护房型、房间、按日期区间定价、员工账号，查看入住率、营业收入、热门房型、长期空闲房间等统计。</w:t>
+        <w:t>（1）日期区间采用［入住日期，离店日期），离店日期必须晚于入住日期。例如，11月1日入住、11月3日离店，占用两个房晚，不与11月3日入住的订单冲突。</w:t>
       </w:r>
     </w:p>
     <w:p>
       <w:pPr>
+        <w:keepNext w:val="0"/>
         <w:spacing w:lineRule="exact" w:line="400" w:before="0" w:after="0"/>
         <w:ind w:firstLine="480"/>
         <w:jc w:val="both"/>
@@ -220,13 +231,63 @@
           <w:color w:val="000000"/>
           <w:sz w:val="24"/>
         </w:rPr>
-        <w:t>系统不扩展为完整酒店信息系统（不含会员营销、渠道直连与硬件对接），聚焦预订、入住、退房与经营统计主链路，在 9 张相互关联的表上实现完整的主外键、检查约束、排他约束与多表统计查询。</w:t>
+        <w:t>（2）房间运行状态分为正常、清洁中、维修中、停用；预订状态单独管理。指定日期是否可订，依据有效订单的占用区间及维修、停用安排判断；实际办理入住时还须确认房间已清洁且可交付。</w:t>
+      </w:r>
+    </w:p>
+    <w:p>
+      <w:pPr>
+        <w:keepNext w:val="0"/>
+        <w:spacing w:lineRule="exact" w:line="400" w:before="0" w:after="0"/>
+        <w:ind w:firstLine="480"/>
+        <w:jc w:val="both"/>
+      </w:pPr>
+      <w:r>
+        <w:rPr>
+          <w:rFonts w:ascii="Times New Roman" w:hAnsi="Times New Roman" w:eastAsia="宋体"/>
+          <w:b w:val="0"/>
+          <w:color w:val="000000"/>
+          <w:sz w:val="24"/>
+        </w:rPr>
+        <w:t>（3）待确认、已确认及入住中的订单占用对应日期；已取消、未到店的订单释放占用。待确认订单由前台确认或取消；未到店由前台按约定到店时限核实后处理。散客入住也须建立订单并检查整个入住区间，续住须检查新增区间。</w:t>
+      </w:r>
+    </w:p>
+    <w:p>
+      <w:pPr>
+        <w:keepNext w:val="0"/>
+        <w:spacing w:lineRule="exact" w:line="400" w:before="0" w:after="0"/>
+        <w:ind w:firstLine="480"/>
+        <w:jc w:val="both"/>
+      </w:pPr>
+      <w:r>
+        <w:rPr>
+          <w:rFonts w:ascii="Times New Roman" w:hAnsi="Times New Roman" w:eastAsia="宋体"/>
+          <w:b w:val="0"/>
+          <w:color w:val="000000"/>
+          <w:sz w:val="24"/>
+        </w:rPr>
+        <w:t>（4）预订确认时保存逐日成交价格，散客入住时保存入住区间价格，后续调价不影响已确认价格。续住新增日期按续住确认时的价格计费。提前退房按实际占用房晚结算，至少计一房晚；超时退房由前台提示并处理，本期不自动加收超时费用。</w:t>
+      </w:r>
+    </w:p>
+    <w:p>
+      <w:pPr>
+        <w:keepNext w:val="0"/>
+        <w:spacing w:lineRule="exact" w:line="400" w:before="0" w:after="0"/>
+        <w:ind w:firstLine="480"/>
+        <w:jc w:val="both"/>
+      </w:pPr>
+      <w:r>
+        <w:rPr>
+          <w:rFonts w:ascii="Times New Roman" w:hAnsi="Times New Roman" w:eastAsia="宋体"/>
+          <w:b w:val="0"/>
+          <w:color w:val="000000"/>
+          <w:sz w:val="24"/>
+        </w:rPr>
+        <w:t>（5）退房结算金额为房费加服务费，再扣除押金，多退少补；押金不计入营业收入。数据库通过主外键、检查约束、日期区间排他约束与事务控制，统一校验预订和散客入住的房间占用，防止重叠日期重复占用。</w:t>
       </w:r>
     </w:p>
     <w:p>
       <w:pPr>
         <w:keepNext/>
-        <w:pageBreakBefore/>
         <w:spacing w:lineRule="exact" w:line="480" w:before="240" w:after="120"/>
       </w:pPr>
       <w:r>
@@ -241,6 +302,7 @@
     </w:p>
     <w:p>
       <w:pPr>
+        <w:keepNext/>
         <w:spacing w:lineRule="exact" w:line="400" w:before="0" w:after="0"/>
         <w:ind w:firstLine="480"/>
         <w:jc w:val="both"/>
@@ -252,18 +314,19 @@
           <w:color w:val="000000"/>
           <w:sz w:val="24"/>
         </w:rPr>
-        <w:t>功能清单共 9 项（要求 5–10 项），覆盖基础信息维护（F01、F02）、业务办理（F04、F06、F07）、状态管理（F02、F05）与查询统计（F03、F09）四类。下表在 Excel 中制作，以截图形式附于本文档。</w:t>
+        <w:t>功能清单共9项，覆盖基础信息维护、业务办理、状态管理及查询统计。P0为核心功能，P1为完善功能。</w:t>
       </w:r>
     </w:p>
     <w:p>
       <w:pPr>
+        <w:keepNext/>
         <w:spacing w:before="120" w:after="60"/>
         <w:jc w:val="center"/>
       </w:pPr>
       <w:r>
         <w:drawing>
           <wp:inline xmlns:a="http://schemas.openxmlformats.org/drawingml/2006/main" xmlns:pic="http://schemas.openxmlformats.org/drawingml/2006/picture">
-            <wp:extent cx="5277600" cy="6315735"/>
+            <wp:extent cx="5277600" cy="6462133"/>
             <wp:docPr id="1" name="Picture 1"/>
             <wp:cNvGraphicFramePr>
               <a:graphicFrameLocks noChangeAspect="1"/>
@@ -284,7 +347,7 @@
                   <pic:spPr>
                     <a:xfrm>
                       <a:off x="0" y="0"/>
-                      <a:ext cx="5277600" cy="6315735"/>
+                      <a:ext cx="5277600" cy="6462133"/>
                     </a:xfrm>
                     <a:prstGeom prst="rect"/>
                   </pic:spPr>
@@ -308,6 +371,56 @@
           <w:sz w:val="21"/>
         </w:rPr>
         <w:t>图 1　软件功能清单（Excel 表格截图）</w:t>
+      </w:r>
+    </w:p>
+    <w:p>
+      <w:pPr>
+        <w:keepNext/>
+        <w:pageBreakBefore/>
+        <w:spacing w:lineRule="exact" w:line="480" w:before="240" w:after="120"/>
+      </w:pPr>
+      <w:r>
+        <w:rPr>
+          <w:rFonts w:ascii="Times New Roman" w:hAnsi="Times New Roman" w:eastAsia="黑体"/>
+          <w:b w:val="0"/>
+          <w:color w:val="000000"/>
+          <w:sz w:val="28"/>
+        </w:rPr>
+        <w:t>四、数据库要点</w:t>
+      </w:r>
+    </w:p>
+    <w:p>
+      <w:pPr>
+        <w:keepNext w:val="0"/>
+        <w:spacing w:lineRule="exact" w:line="400" w:before="0" w:after="0"/>
+        <w:ind w:firstLine="480"/>
+        <w:jc w:val="both"/>
+      </w:pPr>
+      <w:r>
+        <w:rPr>
+          <w:rFonts w:ascii="Times New Roman" w:hAnsi="Times New Roman" w:eastAsia="宋体"/>
+          <w:b w:val="0"/>
+          <w:color w:val="000000"/>
+          <w:sz w:val="24"/>
+        </w:rPr>
+        <w:t>数据库共 13 张表：app_user、customer、room_type、room、rate_plan、reservation、reservation_price（逐日成交价格）、check_in_record、payment、room_status_log、room_block（维修/停用区间）、service_item、service_order。房间运行状态只保留四态：available（正常）、cleaning（清洁中）、maintenance（维修中）、disabled（停用）；“已预订”“入住中”由订单与入住记录推导，不写入房态字段。</w:t>
+      </w:r>
+    </w:p>
+    <w:p>
+      <w:pPr>
+        <w:keepNext w:val="0"/>
+        <w:spacing w:lineRule="exact" w:line="400" w:before="0" w:after="0"/>
+        <w:ind w:firstLine="480"/>
+        <w:jc w:val="both"/>
+      </w:pPr>
+      <w:r>
+        <w:rPr>
+          <w:rFonts w:ascii="Times New Roman" w:hAnsi="Times New Roman" w:eastAsia="宋体"/>
+          <w:b w:val="0"/>
+          <w:color w:val="000000"/>
+          <w:sz w:val="24"/>
+        </w:rPr>
+        <w:t>核心约束“同一房间在重叠日期内不得存在两条有效预订”由生成列 during 上的排他约束实现：during 由 daterange(check_in_date, check_out_date, '[)') 生成，约束为 EXCLUDE USING gist (room_id WITH =, during WITH &amp;&amp;) WHERE (status IN ('pending','confirmed','checked_in'))。维修、停用区间存于 room_block，与订单冲突时拒绝；逐日价格存于 reservation_price，订单总额随明细用触发器汇总；押金不计营业收入，营业收入按退房结算日期归月；入住率的可售房晚需扣除维修、停用占用。</w:t>
       </w:r>
     </w:p>
     <w:sectPr>

</xml_diff>